<commit_message>
Updated the validation task reports
</commit_message>
<xml_diff>
--- a/Evidence/[Validation] IJSObjectReference.DisposeAsync suppresses JSDisconnectedException.docx
+++ b/Evidence/[Validation] IJSObjectReference.DisposeAsync suppresses JSDisconnectedException.docx
@@ -1,6 +1,6 @@
 
 <file path=word/document.xml><?xml version="1.0" encoding="utf-8"?>
-<w:document xmlns:wpc="http://schemas.microsoft.com/office/word/2010/wordprocessingCanvas" xmlns:cx="http://schemas.microsoft.com/office/drawing/2014/chartex" xmlns:cx1="http://schemas.microsoft.com/office/drawing/2015/9/8/chartex" xmlns:cx2="http://schemas.microsoft.com/office/drawing/2015/10/21/chartex" xmlns:cx3="http://schemas.microsoft.com/office/drawing/2016/5/9/chartex" xmlns:cx4="http://schemas.microsoft.com/office/drawing/2016/5/10/chartex" xmlns:cx5="http://schemas.microsoft.com/office/drawing/2016/5/11/chartex" xmlns:cx6="http://schemas.microsoft.com/office/drawing/2016/5/12/chartex" xmlns:cx7="http://schemas.microsoft.com/office/drawing/2016/5/13/chartex" xmlns:cx8="http://schemas.microsoft.com/office/drawing/2016/5/14/chartex" xmlns:mc="http://schemas.openxmlformats.org/markup-compatibility/2006" xmlns:aink="http://schemas.microsoft.com/office/drawing/2016/ink" xmlns:am3d="http://schemas.microsoft.com/office/drawing/2017/model3d" xmlns:o="urn:schemas-microsoft-com:office:office" xmlns:oel="http://schemas.microsoft.com/office/2019/extlst" xmlns:r="http://schemas.openxmlformats.org/officeDocument/2006/relationships" xmlns:m="http://schemas.openxmlformats.org/officeDocument/2006/math" xmlns:v="urn:schemas-microsoft-com:vml" xmlns:wp14="http://schemas.microsoft.com/office/word/2010/wordprocessingDrawing" xmlns:wp="http://schemas.openxmlformats.org/drawingml/2006/wordprocessingDrawing" xmlns:w10="urn:schemas-microsoft-com:office:word" xmlns:w="http://schemas.openxmlformats.org/wordprocessingml/2006/main" xmlns:w14="http://schemas.microsoft.com/office/word/2010/wordml" xmlns:w15="http://schemas.microsoft.com/office/word/2012/wordml" xmlns:w16cei="http://schemas.microsoft.com/office/word/2026/wordml/cei" xmlns:w16cex="http://schemas.microsoft.com/office/word/2018/wordml/cex" xmlns:w16cid="http://schemas.microsoft.com/office/word/2016/wordml/cid" xmlns:w16="http://schemas.microsoft.com/office/word/2018/wordml" xmlns:w16du="http://schemas.microsoft.com/office/word/2023/wordml/word16du" xmlns:w16sdtdh="http://schemas.microsoft.com/office/word/2020/wordml/sdtdatahash" xmlns:w16sdtfl="http://schemas.microsoft.com/office/word/2024/wordml/sdtformatlock" xmlns:w16se="http://schemas.microsoft.com/office/word/2015/wordml/symex" xmlns:wpg="http://schemas.microsoft.com/office/word/2010/wordprocessingGroup" xmlns:wpi="http://schemas.microsoft.com/office/word/2010/wordprocessingInk" xmlns:wne="http://schemas.microsoft.com/office/word/2006/wordml" xmlns:wps="http://schemas.microsoft.com/office/word/2010/wordprocessingShape" mc:Ignorable="w14 w15 w16se w16cid w16 w16cex w16sdtdh w16sdtfl w16du wp14">
+<w:document xmlns:wpc="http://schemas.microsoft.com/office/word/2010/wordprocessingCanvas" xmlns:cx="http://schemas.microsoft.com/office/drawing/2014/chartex" xmlns:cx1="http://schemas.microsoft.com/office/drawing/2015/9/8/chartex" xmlns:cx2="http://schemas.microsoft.com/office/drawing/2015/10/21/chartex" xmlns:cx3="http://schemas.microsoft.com/office/drawing/2016/5/9/chartex" xmlns:cx4="http://schemas.microsoft.com/office/drawing/2016/5/10/chartex" xmlns:cx5="http://schemas.microsoft.com/office/drawing/2016/5/11/chartex" xmlns:cx6="http://schemas.microsoft.com/office/drawing/2016/5/12/chartex" xmlns:cx7="http://schemas.microsoft.com/office/drawing/2016/5/13/chartex" xmlns:cx8="http://schemas.microsoft.com/office/drawing/2016/5/14/chartex" xmlns:mc="http://schemas.openxmlformats.org/markup-compatibility/2006" xmlns:aink="http://schemas.microsoft.com/office/drawing/2016/ink" xmlns:am3d="http://schemas.microsoft.com/office/drawing/2017/model3d" xmlns:o="urn:schemas-microsoft-com:office:office" xmlns:oel="http://schemas.microsoft.com/office/2019/extlst" xmlns:r="http://schemas.openxmlformats.org/officeDocument/2006/relationships" xmlns:m="http://schemas.openxmlformats.org/officeDocument/2006/math" xmlns:v="urn:schemas-microsoft-com:vml" xmlns:wp14="http://schemas.microsoft.com/office/word/2010/wordprocessingDrawing" xmlns:wp="http://schemas.openxmlformats.org/drawingml/2006/wordprocessingDrawing" xmlns:w10="urn:schemas-microsoft-com:office:word" xmlns:w="http://schemas.openxmlformats.org/wordprocessingml/2006/main" xmlns:w14="http://schemas.microsoft.com/office/word/2010/wordml" xmlns:w15="http://schemas.microsoft.com/office/word/2012/wordml" xmlns:w16cex="http://schemas.microsoft.com/office/word/2018/wordml/cex" xmlns:w16cid="http://schemas.microsoft.com/office/word/2016/wordml/cid" xmlns:w16="http://schemas.microsoft.com/office/word/2018/wordml" xmlns:w16du="http://schemas.microsoft.com/office/word/2023/wordml/word16du" xmlns:w16sdtdh="http://schemas.microsoft.com/office/word/2020/wordml/sdtdatahash" xmlns:w16sdtfl="http://schemas.microsoft.com/office/word/2024/wordml/sdtformatlock" xmlns:w16se="http://schemas.microsoft.com/office/word/2015/wordml/symex" xmlns:wpg="http://schemas.microsoft.com/office/word/2010/wordprocessingGroup" xmlns:wpi="http://schemas.microsoft.com/office/word/2010/wordprocessingInk" xmlns:wne="http://schemas.microsoft.com/office/word/2006/wordml" xmlns:wps="http://schemas.microsoft.com/office/word/2010/wordprocessingShape" mc:Ignorable="w14 w15 w16se w16cid w16 w16cex w16sdtdh w16sdtfl w16du wp14">
   <w:body>
     <w:p>
       <w:pPr>
@@ -91,6 +91,13 @@
       </w:r>
       <w:r>
         <w:br/>
+      </w:r>
+      <w:r>
+        <w:rPr>
+          <w:b/>
+          <w:bCs/>
+        </w:rPr>
+        <w:t xml:space="preserve">NET 11 </w:t>
       </w:r>
       <w:r>
         <w:rPr>
@@ -114,6 +121,36 @@
       </w:hyperlink>
     </w:p>
     <w:p>
+      <w:pPr>
+        <w:rPr>
+          <w:b/>
+          <w:bCs/>
+        </w:rPr>
+      </w:pPr>
+      <w:r>
+        <w:rPr>
+          <w:b/>
+          <w:bCs/>
+        </w:rPr>
+        <w:t xml:space="preserve">NET 10 Sample: </w:t>
+      </w:r>
+      <w:hyperlink r:id="rId7" w:history="1">
+        <w:r>
+          <w:rPr>
+            <w:rStyle w:val="Hyperlink"/>
+            <w:b/>
+            <w:bCs/>
+          </w:rPr>
+          <w:t>NET 10 Application</w:t>
+        </w:r>
+      </w:hyperlink>
+    </w:p>
+    <w:p>
+      <w:pPr>
+        <w:rPr>
+          <w:rFonts w:ascii="Aptos" w:eastAsia="Aptos" w:hAnsi="Aptos" w:cs="Aptos"/>
+        </w:rPr>
+      </w:pPr>
       <w:r>
         <w:rPr>
           <w:rFonts w:ascii="Aptos" w:eastAsia="Aptos" w:hAnsi="Aptos" w:cs="Aptos"/>
@@ -126,7 +163,55 @@
         <w:rPr>
           <w:rFonts w:ascii="Aptos" w:eastAsia="Aptos" w:hAnsi="Aptos" w:cs="Aptos"/>
         </w:rPr>
-        <w:t xml:space="preserve"> Working fine.</w:t>
+        <w:t xml:space="preserve"> </w:t>
+      </w:r>
+      <w:r>
+        <w:rPr>
+          <w:rFonts w:ascii="Aptos" w:eastAsia="Aptos" w:hAnsi="Aptos" w:cs="Aptos"/>
+        </w:rPr>
+        <w:t>After closing the browser tab, no </w:t>
+      </w:r>
+      <w:proofErr w:type="spellStart"/>
+      <w:r>
+        <w:rPr>
+          <w:rFonts w:ascii="Aptos" w:eastAsia="Aptos" w:hAnsi="Aptos" w:cs="Aptos"/>
+        </w:rPr>
+        <w:t>JSDisconnectedException</w:t>
+      </w:r>
+      <w:proofErr w:type="spellEnd"/>
+      <w:r>
+        <w:rPr>
+          <w:rFonts w:ascii="Aptos" w:eastAsia="Aptos" w:hAnsi="Aptos" w:cs="Aptos"/>
+        </w:rPr>
+        <w:t> appeared in the application logs.</w:t>
+      </w:r>
+    </w:p>
+    <w:p>
+      <w:pPr>
+        <w:pStyle w:val="Heading3"/>
+        <w:rPr>
+          <w:rFonts w:eastAsia="Aptos"/>
+        </w:rPr>
+      </w:pPr>
+      <w:r>
+        <w:rPr>
+          <w:rFonts w:eastAsia="Aptos"/>
+        </w:rPr>
+        <w:t>Additional Coverage:</w:t>
+      </w:r>
+    </w:p>
+    <w:p>
+      <w:pPr>
+        <w:spacing w:line="276" w:lineRule="auto"/>
+        <w:rPr>
+          <w:rFonts w:ascii="Aptos" w:eastAsia="Aptos" w:hAnsi="Aptos" w:cs="Aptos"/>
+        </w:rPr>
+      </w:pPr>
+      <w:r>
+        <w:rPr>
+          <w:rFonts w:ascii="Aptos" w:eastAsia="Aptos" w:hAnsi="Aptos" w:cs="Aptos"/>
+        </w:rPr>
+        <w:t>No build warnings or errors occurred during testing in either Release or Debug mode.</w:t>
       </w:r>
     </w:p>
     <w:p>
@@ -141,7 +226,7 @@
         </w:rPr>
         <w:t xml:space="preserve">An existing .NET 10 app upgraded to .NET 11: </w:t>
       </w:r>
-      <w:hyperlink r:id="rId7" w:history="1">
+      <w:hyperlink r:id="rId8" w:history="1">
         <w:r>
           <w:rPr>
             <w:rStyle w:val="Hyperlink"/>
@@ -259,7 +344,7 @@
             <w:tcW w:w="5502" w:type="dxa"/>
           </w:tcPr>
           <w:p>
-            <w:hyperlink r:id="rId8" w:history="1">
+            <w:hyperlink r:id="rId9" w:history="1">
               <w:r>
                 <w:rPr>
                   <w:rStyle w:val="Hyperlink"/>
@@ -270,7 +355,7 @@
             <w:r>
               <w:t xml:space="preserve"> / </w:t>
             </w:r>
-            <w:hyperlink r:id="rId9" w:history="1">
+            <w:hyperlink r:id="rId10" w:history="1">
               <w:r>
                 <w:rPr>
                   <w:rStyle w:val="Hyperlink"/>
@@ -326,7 +411,7 @@
             <w:tcW w:w="5502" w:type="dxa"/>
           </w:tcPr>
           <w:p>
-            <w:hyperlink r:id="rId10" w:history="1">
+            <w:hyperlink r:id="rId11" w:history="1">
               <w:r>
                 <w:rPr>
                   <w:rStyle w:val="Hyperlink"/>
@@ -382,7 +467,7 @@
             <w:tcW w:w="5502" w:type="dxa"/>
           </w:tcPr>
           <w:p>
-            <w:hyperlink r:id="rId11" w:history="1">
+            <w:hyperlink r:id="rId12" w:history="1">
               <w:r>
                 <w:rPr>
                   <w:rStyle w:val="Hyperlink"/>
@@ -393,7 +478,7 @@
             <w:r>
               <w:t xml:space="preserve"> / </w:t>
             </w:r>
-            <w:hyperlink r:id="rId12" w:history="1">
+            <w:hyperlink r:id="rId13" w:history="1">
               <w:r>
                 <w:rPr>
                   <w:rStyle w:val="Hyperlink"/>
@@ -421,6 +506,7 @@
           </w:tcPr>
           <w:p>
             <w:r>
+              <w:lastRenderedPageBreak/>
               <w:t>4</w:t>
             </w:r>
           </w:p>
@@ -440,7 +526,7 @@
             <w:tcW w:w="5502" w:type="dxa"/>
           </w:tcPr>
           <w:p>
-            <w:hyperlink r:id="rId13" w:history="1">
+            <w:hyperlink r:id="rId14" w:history="1">
               <w:r>
                 <w:rPr>
                   <w:rStyle w:val="Hyperlink"/>
@@ -451,7 +537,7 @@
             <w:r>
               <w:t xml:space="preserve"> /  </w:t>
             </w:r>
-            <w:hyperlink r:id="rId14" w:history="1">
+            <w:hyperlink r:id="rId15" w:history="1">
               <w:r>
                 <w:rPr>
                   <w:rStyle w:val="Hyperlink"/>
@@ -511,7 +597,7 @@
             <w:tcW w:w="5502" w:type="dxa"/>
           </w:tcPr>
           <w:p>
-            <w:hyperlink r:id="rId15" w:history="1">
+            <w:hyperlink r:id="rId16" w:history="1">
               <w:r>
                 <w:rPr>
                   <w:rStyle w:val="Hyperlink"/>
@@ -522,7 +608,7 @@
             <w:r>
               <w:t xml:space="preserve"> / </w:t>
             </w:r>
-            <w:hyperlink r:id="rId16" w:history="1">
+            <w:hyperlink r:id="rId17" w:history="1">
               <w:r>
                 <w:rPr>
                   <w:rStyle w:val="Hyperlink"/>
@@ -544,7 +630,11 @@
         </w:tc>
       </w:tr>
     </w:tbl>
-    <w:p/>
+    <w:p>
+      <w:pPr>
+        <w:pStyle w:val="Heading3"/>
+      </w:pPr>
+    </w:p>
     <w:sectPr>
       <w:pgSz w:w="12240" w:h="15840"/>
       <w:pgMar w:top="1440" w:right="1440" w:bottom="1440" w:left="1440" w:header="720" w:footer="720" w:gutter="0"/>
@@ -556,7 +646,7 @@
 </file>
 
 <file path=word/numbering.xml><?xml version="1.0" encoding="utf-8"?>
-<w:numbering xmlns:wpc="http://schemas.microsoft.com/office/word/2010/wordprocessingCanvas" xmlns:cx="http://schemas.microsoft.com/office/drawing/2014/chartex" xmlns:cx1="http://schemas.microsoft.com/office/drawing/2015/9/8/chartex" xmlns:cx2="http://schemas.microsoft.com/office/drawing/2015/10/21/chartex" xmlns:cx3="http://schemas.microsoft.com/office/drawing/2016/5/9/chartex" xmlns:cx4="http://schemas.microsoft.com/office/drawing/2016/5/10/chartex" xmlns:cx5="http://schemas.microsoft.com/office/drawing/2016/5/11/chartex" xmlns:cx6="http://schemas.microsoft.com/office/drawing/2016/5/12/chartex" xmlns:cx7="http://schemas.microsoft.com/office/drawing/2016/5/13/chartex" xmlns:cx8="http://schemas.microsoft.com/office/drawing/2016/5/14/chartex" xmlns:mc="http://schemas.openxmlformats.org/markup-compatibility/2006" xmlns:aink="http://schemas.microsoft.com/office/drawing/2016/ink" xmlns:am3d="http://schemas.microsoft.com/office/drawing/2017/model3d" xmlns:o="urn:schemas-microsoft-com:office:office" xmlns:oel="http://schemas.microsoft.com/office/2019/extlst" xmlns:r="http://schemas.openxmlformats.org/officeDocument/2006/relationships" xmlns:m="http://schemas.openxmlformats.org/officeDocument/2006/math" xmlns:v="urn:schemas-microsoft-com:vml" xmlns:wp14="http://schemas.microsoft.com/office/word/2010/wordprocessingDrawing" xmlns:wp="http://schemas.openxmlformats.org/drawingml/2006/wordprocessingDrawing" xmlns:w10="urn:schemas-microsoft-com:office:word" xmlns:w="http://schemas.openxmlformats.org/wordprocessingml/2006/main" xmlns:w14="http://schemas.microsoft.com/office/word/2010/wordml" xmlns:w15="http://schemas.microsoft.com/office/word/2012/wordml" xmlns:w16cei="http://schemas.microsoft.com/office/word/2026/wordml/cei" xmlns:w16cex="http://schemas.microsoft.com/office/word/2018/wordml/cex" xmlns:w16cid="http://schemas.microsoft.com/office/word/2016/wordml/cid" xmlns:w16="http://schemas.microsoft.com/office/word/2018/wordml" xmlns:w16du="http://schemas.microsoft.com/office/word/2023/wordml/word16du" xmlns:w16sdtdh="http://schemas.microsoft.com/office/word/2020/wordml/sdtdatahash" xmlns:w16sdtfl="http://schemas.microsoft.com/office/word/2024/wordml/sdtformatlock" xmlns:w16se="http://schemas.microsoft.com/office/word/2015/wordml/symex" xmlns:wpg="http://schemas.microsoft.com/office/word/2010/wordprocessingGroup" xmlns:wpi="http://schemas.microsoft.com/office/word/2010/wordprocessingInk" xmlns:wne="http://schemas.microsoft.com/office/word/2006/wordml" xmlns:wps="http://schemas.microsoft.com/office/word/2010/wordprocessingShape" mc:Ignorable="w14 w15 w16se w16cid w16 w16cex w16sdtdh w16sdtfl w16du wp14">
+<w:numbering xmlns:wpc="http://schemas.microsoft.com/office/word/2010/wordprocessingCanvas" xmlns:cx="http://schemas.microsoft.com/office/drawing/2014/chartex" xmlns:cx1="http://schemas.microsoft.com/office/drawing/2015/9/8/chartex" xmlns:cx2="http://schemas.microsoft.com/office/drawing/2015/10/21/chartex" xmlns:cx3="http://schemas.microsoft.com/office/drawing/2016/5/9/chartex" xmlns:cx4="http://schemas.microsoft.com/office/drawing/2016/5/10/chartex" xmlns:cx5="http://schemas.microsoft.com/office/drawing/2016/5/11/chartex" xmlns:cx6="http://schemas.microsoft.com/office/drawing/2016/5/12/chartex" xmlns:cx7="http://schemas.microsoft.com/office/drawing/2016/5/13/chartex" xmlns:cx8="http://schemas.microsoft.com/office/drawing/2016/5/14/chartex" xmlns:mc="http://schemas.openxmlformats.org/markup-compatibility/2006" xmlns:aink="http://schemas.microsoft.com/office/drawing/2016/ink" xmlns:am3d="http://schemas.microsoft.com/office/drawing/2017/model3d" xmlns:o="urn:schemas-microsoft-com:office:office" xmlns:oel="http://schemas.microsoft.com/office/2019/extlst" xmlns:r="http://schemas.openxmlformats.org/officeDocument/2006/relationships" xmlns:m="http://schemas.openxmlformats.org/officeDocument/2006/math" xmlns:v="urn:schemas-microsoft-com:vml" xmlns:wp14="http://schemas.microsoft.com/office/word/2010/wordprocessingDrawing" xmlns:wp="http://schemas.openxmlformats.org/drawingml/2006/wordprocessingDrawing" xmlns:w10="urn:schemas-microsoft-com:office:word" xmlns:w="http://schemas.openxmlformats.org/wordprocessingml/2006/main" xmlns:w14="http://schemas.microsoft.com/office/word/2010/wordml" xmlns:w15="http://schemas.microsoft.com/office/word/2012/wordml" xmlns:w16cex="http://schemas.microsoft.com/office/word/2018/wordml/cex" xmlns:w16cid="http://schemas.microsoft.com/office/word/2016/wordml/cid" xmlns:w16="http://schemas.microsoft.com/office/word/2018/wordml" xmlns:w16du="http://schemas.microsoft.com/office/word/2023/wordml/word16du" xmlns:w16sdtdh="http://schemas.microsoft.com/office/word/2020/wordml/sdtdatahash" xmlns:w16sdtfl="http://schemas.microsoft.com/office/word/2024/wordml/sdtformatlock" xmlns:w16se="http://schemas.microsoft.com/office/word/2015/wordml/symex" xmlns:wpg="http://schemas.microsoft.com/office/word/2010/wordprocessingGroup" xmlns:wpi="http://schemas.microsoft.com/office/word/2010/wordprocessingInk" xmlns:wne="http://schemas.microsoft.com/office/word/2006/wordml" xmlns:wps="http://schemas.microsoft.com/office/word/2010/wordprocessingShape" mc:Ignorable="w14 w15 w16se w16cid w16 w16cex w16sdtdh w16sdtfl w16du wp14">
   <w:abstractNum w:abstractNumId="0" w15:restartNumberingAfterBreak="0">
     <w:nsid w:val="0B305292"/>
     <w:multiLevelType w:val="multilevel"/>
@@ -1582,7 +1672,6 @@
     <w:next w:val="Normal"/>
     <w:link w:val="Heading3Char"/>
     <w:uiPriority w:val="9"/>
-    <w:semiHidden/>
     <w:unhideWhenUsed/>
     <w:qFormat/>
     <w:rsid w:val="00866A23"/>
@@ -1788,7 +1877,6 @@
     <w:basedOn w:val="DefaultParagraphFont"/>
     <w:link w:val="Heading3"/>
     <w:uiPriority w:val="9"/>
-    <w:semiHidden/>
     <w:rsid w:val="00866A23"/>
     <w:rPr>
       <w:rFonts w:eastAsiaTheme="majorEastAsia" w:cstheme="majorBidi"/>

</xml_diff>